<commit_message>
fix(briefings): correct Briefing 05 opening, examples, and closing
Narrow the enforceable control point to the proposed action against a
downstream system, distinct from human reliance on AI output.

Co-Authored-By: Claude Opus 5.5 <noreply@anthropic.com>
</commit_message>
<xml_diff>
--- a/briefings-source/Strategic_Intelligence_Briefing_05.docx
+++ b/briefings-source/Strategic_Intelligence_Briefing_05.docx
@@ -286,7 +286,7 @@
           <w:rFonts w:ascii="Aptos" w:hAnsi="Aptos"/>
           <w:b/>
         </w:rPr>
-        <w:t>Enterprises are moving AI generated output into real work faster than their control models can absorb. AI output becomes consequential long before any automated action occurs. The moment a summary shapes how a decision is framed, or a risk classification changes who receives review, output has already entered the decision path. The dangerous assumption is that output remains harmless until a system executes an action on its own. The stronger enterprise view is that AI output becomes control relevant the moment it begins shaping the path toward execution.</w:t>
+        <w:t>Enterprises are moving AI generated output into real work faster than their control models can absorb. Output can shape a human decision long before any automated action occurs, and that influence needs governance. The enforceable control point comes later. It arrives when output becomes a proposed action against a downstream system: a payment, a record change, an access grant, or a code deployment.</w:t>
       </w:r>
     </w:p>
     <w:p>
@@ -338,7 +338,7 @@
         <w:rPr>
           <w:rFonts w:ascii="Aptos" w:hAnsi="Aptos"/>
         </w:rPr>
-        <w:t>AI output does not need to be autonomous to create execution risk. The change often comes through human judgment operating on AI content: an analyst adopts a summary, a supervisor relies on an exception rationale, a reviewer accepts a classification, a manager advances a workflow, a compliance officer reprioritizes a queue. In each case, the system may not execute the final step, but the output has already changed the decision path. The control layer has to operate before that path becomes action.</w:t>
+        <w:t>AI output does not need to be autonomous to create risk. An analyst may adopt a summary, or a reviewer may accept a classification. Review standards and supervision govern that reliance. DAL-X addresses a narrower point. When the resulting action is submitted for execution, the downstream system rejects it without valid authority for the exact action.</w:t>
       </w:r>
     </w:p>
     <w:p>
@@ -349,14 +349,14 @@
         <w:rPr>
           <w:rFonts w:ascii="Aptos" w:hAnsi="Aptos"/>
         </w:rPr>
-        <w:t xml:space="preserve">A customer remediation team may use AI to classify complaints by severity. If the classification changes which customers receive escalation, which cases receive faster handling, or which issues are treated as low risk, the </w:t>
+        <w:t>A customer remediation team may use AI to classify complaints by severity. Review standards govern how staff rely on that classification. When an agent proposes to close a case, issue a refund, or change a customer record, the enterprise needs valid authority for that exact action before the system executes it.</w:t>
       </w:r>
       <w:r>
         <w:rPr>
           <w:rFonts w:ascii="Aptos" w:hAnsi="Aptos"/>
         </w:rPr>
         <w:lastRenderedPageBreak/>
-        <w:t>enterprise cannot rely only on the fact that a human later reviewed the queue. The control question is whether the AI generated classification was allowed to influence remediation priority under the firm's authority model.</w:t>
+        <w:t/>
       </w:r>
     </w:p>
     <w:p>
@@ -502,7 +502,7 @@
         <w:rPr>
           <w:rFonts w:ascii="Aptos" w:hAnsi="Aptos"/>
         </w:rPr>
-        <w:t>Decision Governance names the missing control discipline because the enterprise outcome is created through a decision path. A model output may start the path, an agent may accelerate it, and a human may complete it. The governed question is whether the path had authority before the organization acted. A control layer between output and execution gives the enterprise a place to enforce that question before consequence becomes real.</w:t>
+        <w:t>Decision Governance names the missing control discipline because consequence begins when an action executes. A model output may start the work, an agent may propose the action, and a human may approve it. The governed question is whether that exact execution had valid authority before it ran. A control layer between output and execution, enforced by the downstream system, gives the enterprise a place to answer that question before consequence becomes real.</w:t>
       </w:r>
     </w:p>
     <w:p>
@@ -513,7 +513,7 @@
         <w:rPr>
           <w:rFonts w:ascii="Aptos" w:hAnsi="Aptos"/>
         </w:rPr>
-        <w:t>This is why enterprises need a control layer between AI output and execution. AI adoption will continue to accelerate, and the volume of generated work will only increase. The institutions that protect themselves will not be the ones that merely document output after it moves. They will be the ones that can prove what AI output was allowed to influence before execution occurred.</w:t>
+        <w:t>This is why enterprises need a control layer between AI output and execution. AI adoption will continue to accelerate, and the volume of generated work will only increase. The institutions that protect themselves will not be the ones that merely document output after it moves. They will be the ones that can prove which consequential executions were authorized before they ran.</w:t>
       </w:r>
     </w:p>
     <w:p>

</xml_diff>